<commit_message>
Update VKR thesis: add 3-dataset results (AUC 0.959), fix limitations and conclusion
</commit_message>
<xml_diff>
--- a/VKRDoc/VKR_FINAL(v14).docx
+++ b/VKRDoc/VKR_FINAL(v14).docx
@@ -10215,7 +10215,7 @@
           <w:color w:val="000000"/>
           <w:sz w:val="28"/>
         </w:rPr>
-        <w:t>4.5. Анализ ошибок</w:t>
+        <w:t>4.4.4. Обучение на трёх наборах данных (DFDC02 + DFD01 + Celeb-DF v2)</w:t>
       </w:r>
     </w:p>
     <w:p>
@@ -10228,6 +10228,545 @@
           <w:rFonts w:ascii="Times New Roman" w:hAnsi="Times New Roman"/>
           <w:sz w:val="28"/>
         </w:rPr>
+        <w:t>Для дальнейшего исследования влияния разнородности обучающей выборки проведена серия экспериментов с обучением на трёх наборах данных: DFDC02 (3293 видео), DFD01 (3431 видео) и Celeb-DF v2 (3299 видео). Суммарный объём обучающей выборки составил 10023 видеоролика.</w:t>
+      </w:r>
+    </w:p>
+    <w:p>
+      <w:pPr>
+        <w:ind w:firstLine="709"/>
+        <w:jc w:val="both"/>
+      </w:pPr>
+      <w:r>
+        <w:rPr>
+          <w:rFonts w:ascii="Times New Roman" w:hAnsi="Times New Roman"/>
+          <w:sz w:val="28"/>
+        </w:rPr>
+        <w:t>Таблица 4.7 — Результаты обучения на трёх наборах данных (T=16)</w:t>
+      </w:r>
+    </w:p>
+    <w:tbl>
+      <w:tblPr>
+        <w:tblW w:w="9072" w:type="dxa"/>
+        <w:tblBorders>
+          <w:top w:val="single" w:sz="4" w:color="000000"/>
+          <w:left w:val="single" w:sz="4" w:color="000000"/>
+          <w:bottom w:val="single" w:sz="4" w:color="000000"/>
+          <w:right w:val="single" w:sz="4" w:color="000000"/>
+          <w:insideH w:val="single" w:sz="4" w:color="000000"/>
+          <w:insideV w:val="single" w:sz="4" w:color="000000"/>
+        </w:tblBorders>
+      </w:tblPr>
+      <w:tblGrid>
+        <w:gridCol w:w="2800"/>
+        <w:gridCol w:w="1100"/>
+        <w:gridCol w:w="1100"/>
+        <w:gridCol w:w="1100"/>
+        <w:gridCol w:w="1100"/>
+        <w:gridCol w:w="1872"/>
+      </w:tblGrid>
+      <w:tr>
+        <w:tc>
+          <w:p>
+            <w:r>
+              <w:rPr>
+                <w:rFonts w:ascii="Times New Roman" w:hAnsi="Times New Roman"/>
+                <w:b/>
+                <w:sz w:val="24"/>
+              </w:rPr>
+              <w:t>Модель</w:t>
+            </w:r>
+          </w:p>
+        </w:tc>
+        <w:tc>
+          <w:p>
+            <w:pPr>
+              <w:jc w:val="center"/>
+            </w:pPr>
+            <w:r>
+              <w:rPr>
+                <w:rFonts w:ascii="Times New Roman" w:hAnsi="Times New Roman"/>
+                <w:b/>
+                <w:sz w:val="24"/>
+              </w:rPr>
+              <w:t>AUC</w:t>
+            </w:r>
+          </w:p>
+        </w:tc>
+        <w:tc>
+          <w:p>
+            <w:pPr>
+              <w:jc w:val="center"/>
+            </w:pPr>
+            <w:r>
+              <w:rPr>
+                <w:rFonts w:ascii="Times New Roman" w:hAnsi="Times New Roman"/>
+                <w:b/>
+                <w:sz w:val="24"/>
+              </w:rPr>
+              <w:t>Acc</w:t>
+            </w:r>
+          </w:p>
+        </w:tc>
+        <w:tc>
+          <w:p>
+            <w:pPr>
+              <w:jc w:val="center"/>
+            </w:pPr>
+            <w:r>
+              <w:rPr>
+                <w:rFonts w:ascii="Times New Roman" w:hAnsi="Times New Roman"/>
+                <w:b/>
+                <w:sz w:val="24"/>
+              </w:rPr>
+              <w:t>F1</w:t>
+            </w:r>
+          </w:p>
+        </w:tc>
+        <w:tc>
+          <w:p>
+            <w:pPr>
+              <w:jc w:val="center"/>
+            </w:pPr>
+            <w:r>
+              <w:rPr>
+                <w:rFonts w:ascii="Times New Roman" w:hAnsi="Times New Roman"/>
+                <w:b/>
+                <w:sz w:val="24"/>
+              </w:rPr>
+              <w:t>EER</w:t>
+            </w:r>
+          </w:p>
+        </w:tc>
+        <w:tc>
+          <w:p>
+            <w:pPr>
+              <w:jc w:val="center"/>
+            </w:pPr>
+            <w:r>
+              <w:rPr>
+                <w:rFonts w:ascii="Times New Roman" w:hAnsi="Times New Roman"/>
+                <w:b/>
+                <w:sz w:val="24"/>
+              </w:rPr>
+              <w:t>Best Epoch</w:t>
+            </w:r>
+          </w:p>
+        </w:tc>
+      </w:tr>
+      <w:tr>
+        <w:tc>
+          <w:p>
+            <w:r>
+              <w:rPr>
+                <w:rFonts w:ascii="Times New Roman" w:hAnsi="Times New Roman"/>
+                <w:b/>
+                <w:sz w:val="24"/>
+              </w:rPr>
+              <w:t>A1 Full (dual-path)</w:t>
+            </w:r>
+          </w:p>
+        </w:tc>
+        <w:tc>
+          <w:p>
+            <w:pPr>
+              <w:jc w:val="center"/>
+            </w:pPr>
+            <w:r>
+              <w:rPr>
+                <w:rFonts w:ascii="Times New Roman" w:hAnsi="Times New Roman"/>
+                <w:b/>
+                <w:sz w:val="24"/>
+              </w:rPr>
+              <w:t>0.9587</w:t>
+            </w:r>
+          </w:p>
+        </w:tc>
+        <w:tc>
+          <w:p>
+            <w:pPr>
+              <w:jc w:val="center"/>
+            </w:pPr>
+            <w:r>
+              <w:rPr>
+                <w:rFonts w:ascii="Times New Roman" w:hAnsi="Times New Roman"/>
+                <w:b/>
+                <w:sz w:val="24"/>
+              </w:rPr>
+              <w:t>0.9436</w:t>
+            </w:r>
+          </w:p>
+        </w:tc>
+        <w:tc>
+          <w:p>
+            <w:pPr>
+              <w:jc w:val="center"/>
+            </w:pPr>
+            <w:r>
+              <w:rPr>
+                <w:rFonts w:ascii="Times New Roman" w:hAnsi="Times New Roman"/>
+                <w:b/>
+                <w:sz w:val="24"/>
+              </w:rPr>
+              <w:t>0.9622</w:t>
+            </w:r>
+          </w:p>
+        </w:tc>
+        <w:tc>
+          <w:p>
+            <w:pPr>
+              <w:jc w:val="center"/>
+            </w:pPr>
+            <w:r>
+              <w:rPr>
+                <w:rFonts w:ascii="Times New Roman" w:hAnsi="Times New Roman"/>
+                <w:sz w:val="24"/>
+              </w:rPr>
+              <w:t>0.1211</w:t>
+            </w:r>
+          </w:p>
+        </w:tc>
+        <w:tc>
+          <w:p>
+            <w:pPr>
+              <w:jc w:val="center"/>
+            </w:pPr>
+            <w:r>
+              <w:rPr>
+                <w:rFonts w:ascii="Times New Roman" w:hAnsi="Times New Roman"/>
+                <w:sz w:val="24"/>
+              </w:rPr>
+              <w:t>16</w:t>
+            </w:r>
+          </w:p>
+        </w:tc>
+      </w:tr>
+      <w:tr>
+        <w:tc>
+          <w:p>
+            <w:r>
+              <w:rPr>
+                <w:rFonts w:ascii="Times New Roman" w:hAnsi="Times New Roman"/>
+                <w:sz w:val="24"/>
+              </w:rPr>
+              <w:t>A3 Temporal-only</w:t>
+            </w:r>
+          </w:p>
+        </w:tc>
+        <w:tc>
+          <w:p>
+            <w:pPr>
+              <w:jc w:val="center"/>
+            </w:pPr>
+            <w:r>
+              <w:rPr>
+                <w:rFonts w:ascii="Times New Roman" w:hAnsi="Times New Roman"/>
+                <w:sz w:val="24"/>
+              </w:rPr>
+              <w:t>0.9539</w:t>
+            </w:r>
+          </w:p>
+        </w:tc>
+        <w:tc>
+          <w:p>
+            <w:pPr>
+              <w:jc w:val="center"/>
+            </w:pPr>
+            <w:r>
+              <w:rPr>
+                <w:rFonts w:ascii="Times New Roman" w:hAnsi="Times New Roman"/>
+                <w:sz w:val="24"/>
+              </w:rPr>
+              <w:t>0.9150</w:t>
+            </w:r>
+          </w:p>
+        </w:tc>
+        <w:tc>
+          <w:p>
+            <w:pPr>
+              <w:jc w:val="center"/>
+            </w:pPr>
+            <w:r>
+              <w:rPr>
+                <w:rFonts w:ascii="Times New Roman" w:hAnsi="Times New Roman"/>
+                <w:sz w:val="24"/>
+              </w:rPr>
+              <w:t>0.9412</w:t>
+            </w:r>
+          </w:p>
+        </w:tc>
+        <w:tc>
+          <w:p>
+            <w:pPr>
+              <w:jc w:val="center"/>
+            </w:pPr>
+            <w:r>
+              <w:rPr>
+                <w:rFonts w:ascii="Times New Roman" w:hAnsi="Times New Roman"/>
+                <w:sz w:val="24"/>
+              </w:rPr>
+              <w:t>0.1168</w:t>
+            </w:r>
+          </w:p>
+        </w:tc>
+        <w:tc>
+          <w:p>
+            <w:pPr>
+              <w:jc w:val="center"/>
+            </w:pPr>
+            <w:r>
+              <w:rPr>
+                <w:rFonts w:ascii="Times New Roman" w:hAnsi="Times New Roman"/>
+                <w:sz w:val="24"/>
+              </w:rPr>
+              <w:t>17</w:t>
+            </w:r>
+          </w:p>
+        </w:tc>
+      </w:tr>
+      <w:tr>
+        <w:tc>
+          <w:p>
+            <w:r>
+              <w:rPr>
+                <w:rFonts w:ascii="Times New Roman" w:hAnsi="Times New Roman"/>
+                <w:sz w:val="24"/>
+              </w:rPr>
+              <w:t>A2 Spatial-only</w:t>
+            </w:r>
+          </w:p>
+        </w:tc>
+        <w:tc>
+          <w:p>
+            <w:pPr>
+              <w:jc w:val="center"/>
+            </w:pPr>
+            <w:r>
+              <w:rPr>
+                <w:rFonts w:ascii="Times New Roman" w:hAnsi="Times New Roman"/>
+                <w:sz w:val="24"/>
+              </w:rPr>
+              <w:t>0.9494</w:t>
+            </w:r>
+          </w:p>
+        </w:tc>
+        <w:tc>
+          <w:p>
+            <w:pPr>
+              <w:jc w:val="center"/>
+            </w:pPr>
+            <w:r>
+              <w:rPr>
+                <w:rFonts w:ascii="Times New Roman" w:hAnsi="Times New Roman"/>
+                <w:sz w:val="24"/>
+              </w:rPr>
+              <w:t>0.9303</w:t>
+            </w:r>
+          </w:p>
+        </w:tc>
+        <w:tc>
+          <w:p>
+            <w:pPr>
+              <w:jc w:val="center"/>
+            </w:pPr>
+            <w:r>
+              <w:rPr>
+                <w:rFonts w:ascii="Times New Roman" w:hAnsi="Times New Roman"/>
+                <w:sz w:val="24"/>
+              </w:rPr>
+              <w:t>0.9538</w:t>
+            </w:r>
+          </w:p>
+        </w:tc>
+        <w:tc>
+          <w:p>
+            <w:pPr>
+              <w:jc w:val="center"/>
+            </w:pPr>
+            <w:r>
+              <w:rPr>
+                <w:rFonts w:ascii="Times New Roman" w:hAnsi="Times New Roman"/>
+                <w:sz w:val="24"/>
+              </w:rPr>
+              <w:t>0.1479</w:t>
+            </w:r>
+          </w:p>
+        </w:tc>
+        <w:tc>
+          <w:p>
+            <w:pPr>
+              <w:jc w:val="center"/>
+            </w:pPr>
+            <w:r>
+              <w:rPr>
+                <w:rFonts w:ascii="Times New Roman" w:hAnsi="Times New Roman"/>
+                <w:sz w:val="24"/>
+              </w:rPr>
+              <w:t>18</w:t>
+            </w:r>
+          </w:p>
+        </w:tc>
+      </w:tr>
+      <w:tr>
+        <w:tc>
+          <w:p>
+            <w:r>
+              <w:rPr>
+                <w:rFonts w:ascii="Times New Roman" w:hAnsi="Times New Roman"/>
+                <w:sz w:val="24"/>
+              </w:rPr>
+              <w:t>A4 Sequential</w:t>
+            </w:r>
+          </w:p>
+        </w:tc>
+        <w:tc>
+          <w:p>
+            <w:pPr>
+              <w:jc w:val="center"/>
+            </w:pPr>
+            <w:r>
+              <w:rPr>
+                <w:rFonts w:ascii="Times New Roman" w:hAnsi="Times New Roman"/>
+                <w:sz w:val="24"/>
+              </w:rPr>
+              <w:t>0.9490</w:t>
+            </w:r>
+          </w:p>
+        </w:tc>
+        <w:tc>
+          <w:p>
+            <w:pPr>
+              <w:jc w:val="center"/>
+            </w:pPr>
+            <w:r>
+              <w:rPr>
+                <w:rFonts w:ascii="Times New Roman" w:hAnsi="Times New Roman"/>
+                <w:sz w:val="24"/>
+              </w:rPr>
+              <w:t>0.9203</w:t>
+            </w:r>
+          </w:p>
+        </w:tc>
+        <w:tc>
+          <w:p>
+            <w:pPr>
+              <w:jc w:val="center"/>
+            </w:pPr>
+            <w:r>
+              <w:rPr>
+                <w:rFonts w:ascii="Times New Roman" w:hAnsi="Times New Roman"/>
+                <w:sz w:val="24"/>
+              </w:rPr>
+              <w:t>0.9464</w:t>
+            </w:r>
+          </w:p>
+        </w:tc>
+        <w:tc>
+          <w:p>
+            <w:pPr>
+              <w:jc w:val="center"/>
+            </w:pPr>
+            <w:r>
+              <w:rPr>
+                <w:rFonts w:ascii="Times New Roman" w:hAnsi="Times New Roman"/>
+                <w:sz w:val="24"/>
+              </w:rPr>
+              <w:t>0.1393</w:t>
+            </w:r>
+          </w:p>
+        </w:tc>
+        <w:tc>
+          <w:p>
+            <w:pPr>
+              <w:jc w:val="center"/>
+            </w:pPr>
+            <w:r>
+              <w:rPr>
+                <w:rFonts w:ascii="Times New Roman" w:hAnsi="Times New Roman"/>
+                <w:sz w:val="24"/>
+              </w:rPr>
+              <w:t>20</w:t>
+            </w:r>
+          </w:p>
+        </w:tc>
+      </w:tr>
+    </w:tbl>
+    <w:p>
+      <w:pPr>
+        <w:ind w:firstLine="709"/>
+        <w:jc w:val="both"/>
+      </w:pPr>
+      <w:r>
+        <w:rPr>
+          <w:rFonts w:ascii="Times New Roman" w:hAnsi="Times New Roman"/>
+          <w:sz w:val="28"/>
+        </w:rPr>
+        <w:t>Добавление третьего набора данных (Celeb-DF v2) привело к значительному повышению качества детектирования по сравнению с обучением на двух датасетах: AUC полной модели возрос с 0.899 до 0.959 (+6.0%). Это объясняется двумя факторами.</w:t>
+      </w:r>
+    </w:p>
+    <w:p>
+      <w:pPr>
+        <w:ind w:firstLine="709"/>
+        <w:jc w:val="both"/>
+      </w:pPr>
+      <w:r>
+        <w:rPr>
+          <w:rFonts w:ascii="Times New Roman" w:hAnsi="Times New Roman"/>
+          <w:sz w:val="28"/>
+        </w:rPr>
+        <w:t>Первое — улучшение баланса классов. Объединённый набор из двух датасетов характеризуется выраженным дисбалансом: DFD01 содержит лишь 10.6% реальных видео (363 из 3431), что смещает обучение. Добавление Celeb-DF v2 (17.9% реальных, 589 из 3299) частично компенсирует этот дисбаланс.</w:t>
+      </w:r>
+    </w:p>
+    <w:p>
+      <w:pPr>
+        <w:ind w:firstLine="709"/>
+        <w:jc w:val="both"/>
+      </w:pPr>
+      <w:r>
+        <w:rPr>
+          <w:rFonts w:ascii="Times New Roman" w:hAnsi="Times New Roman"/>
+          <w:sz w:val="28"/>
+        </w:rPr>
+        <w:t>Второе — увеличение разнообразия методов манипуляции. Celeb-DF v2 использует улучшенный алгоритм face swap с автоматической цветокоррекцией и post-processing, что отличается от методов DFDC и DFD01. Модель, обученная на трёх различных типах манипуляций, лучше выделяет инвариантные признаки deepfake.</w:t>
+      </w:r>
+    </w:p>
+    <w:p>
+      <w:pPr>
+        <w:ind w:firstLine="709"/>
+        <w:jc w:val="both"/>
+      </w:pPr>
+      <w:r>
+        <w:rPr>
+          <w:rFonts w:ascii="Times New Roman" w:hAnsi="Times New Roman"/>
+          <w:sz w:val="28"/>
+        </w:rPr>
+        <w:t>Примечательно, что при обучении на трёх датасетах полная dual-path модель (A1, AUC 0.959) вновь превосходит все ablation-варианты, что подтверждает важность совместного пространственно-временного анализа при обучении на гетерогенных данных.</w:t>
+      </w:r>
+    </w:p>
+    <w:p>
+      <w:pPr>
+        <w:pStyle w:val="Heading2"/>
+        <w:ind w:firstLine="709"/>
+      </w:pPr>
+      <w:r>
+        <w:rPr>
+          <w:rFonts w:ascii="Times New Roman" w:hAnsi="Times New Roman"/>
+          <w:b/>
+          <w:color w:val="000000"/>
+          <w:sz w:val="28"/>
+        </w:rPr>
+        <w:t>4.5. Анализ ошибок</w:t>
+      </w:r>
+    </w:p>
+    <w:p>
+      <w:pPr>
+        <w:ind w:firstLine="709"/>
+        <w:jc w:val="both"/>
+      </w:pPr>
+      <w:r>
+        <w:rPr>
+          <w:rFonts w:ascii="Times New Roman" w:hAnsi="Times New Roman"/>
+          <w:sz w:val="28"/>
+        </w:rPr>
         <w:t>Для понимания ограничений метода код evaluation pipeline автоматически классифицирует ошибки на ложноотрицательные (FN — пропущенные манипуляции) и ложноположительные (FP — реальные видео, ошибочно классифицированные как fake).</w:t>
       </w:r>
     </w:p>
@@ -10409,7 +10948,7 @@
           <w:rFonts w:ascii="Times New Roman" w:hAnsi="Times New Roman"/>
           <w:sz w:val="28"/>
         </w:rPr>
-        <w:t>Первое: несмотря на проведённое мульти-датасетное обучение (DFDC02 + DFD01), экспериментальная оценка пока ограничена двумя наборами данных. Расширение обучающей выборки за счёт Celeb-DF-v2 и оценка на FaceForensics++ являются приоритетными направлениями дальнейшего развития.</w:t>
+        <w:t>Первое: экспериментальная оценка выполнена на трёх наборах данных (DFDC02, DFD01, Celeb-DF v2), что повысило обобщающую способность модели (AUC 0.959). Однако для полной оценки генерализации необходимо тестирование на дополнительных датасетах (FaceForensics++, WildDeepfake) и на видео, сгенерированных диффузионными моделями.</w:t>
       </w:r>
     </w:p>
     <w:p>
@@ -10609,7 +11148,7 @@
           <w:b/>
           <w:sz w:val="28"/>
         </w:rPr>
-        <w:t>По задаче 5 выполнена экспериментальная оценка предлагаемого метода в трёх измерениях. На DFDC02 (T=32) достигнуты значения AUC 0.987, Accuracy 95.7%, F1-score 0.955 и EER 0.045. Мульти-датасетное обучение (DFDC02 + DFD01, T=16) показало AUC 0.899 для полной модели, при этом выявлено, что временна́я ветвь (AUC 0.900) превосходит пространственную (AUC 0.897) по обобщающей способности на разнородных данных. Увеличение длины клипа с T=16 до T=32 даёт устойчивый прирост AUC от +0.005 до +0.010.</w:t>
+        <w:t>По задаче 5 выполнена экспериментальная оценка предлагаемого метода в трёх измерениях. На DFDC02 (T=32) достигнуты значения AUC 0.987, Accuracy 95.7%, F1-score 0.955 и EER 0.045. Мульти-датасетное обучение (DFDC02 + DFD01, T=16) показало AUC 0.899 для полной модели. Обучение на трёх объединённых наборах данных (DFDC02 + DFD01 + Celeb-DF v2, 10023 видео) показало AUC 0.959 с точностью 94.4% и F1-score 0.962, подтверждая эффективность мультидатасетного подхода для повышения обобщающей способности. Увеличение длины клипа с T=16 до T=32 даёт устойчивый прирост AUC от +0.005 до +0.010.</w:t>
       </w:r>
     </w:p>
     <w:p>
@@ -10637,7 +11176,7 @@
           <w:b/>
           <w:sz w:val="28"/>
         </w:rPr>
-        <w:t>Ограничения. Основные ограничения метода: экспериментальная оценка проведена на двух наборах данных (DFDC02 и DFD01), расширение на Celeb-DF-v2 в процессе выполнения; бинарная классификация без определения типа манипуляции; отсутствие геометрического выравнивания лицевых областей; незавершённая визуализация attention maps; вычислительная стоимость при T=32 ограничивает размер пакета.</w:t>
+        <w:t>Ограничения. Основные ограничения метода: экспериментальная оценка проведена на трёх наборах данных (DFDC02, DFD01 и Celeb-DF v2); для полной оценки генерализации целесообразно расширение на FaceForensics++ и современные диффузионные модели; бинарная классификация без определения типа манипуляции; отсутствие геометрического выравнивания лицевых областей; вычислительная стоимость при T=32 ограничивает размер пакета.</w:t>
       </w:r>
     </w:p>
     <w:p>
@@ -10671,7 +11210,7 @@
           <w:rFonts w:ascii="Times New Roman" w:hAnsi="Times New Roman"/>
           <w:sz w:val="28"/>
         </w:rPr>
-        <w:t>Первое — завершение обучения на трёх датасетах (DFDC02 + DFD01 + Celeb-DF-v2) для T=16 и T=32; расширение экспериментальной оценки на FaceForensics++; масштабирование cross-dataset evaluation; исследование fine-tuning backbone при наличии стабильной CUDA-среды.</w:t>
+        <w:t>Первое — завершение обучения на трёх датасетах для T=32 (T=16 завершено, AUC 0.959); расширение экспериментальной оценки на FaceForensics++; масштабирование cross-dataset evaluation; исследование fine-tuning backbone при наличии стабильной CUDA-среды.</w:t>
       </w:r>
     </w:p>
     <w:p>

</xml_diff>

<commit_message>
Final VKR fixes: correct 3DS analysis, remove contradictions, update appendix
</commit_message>
<xml_diff>
--- a/VKRDoc/VKR_FINAL(v14).docx
+++ b/VKRDoc/VKR_FINAL(v14).docx
@@ -400,7 +400,7 @@
           <w:rFonts w:ascii="Times New Roman" w:hAnsi="Times New Roman"/>
           <w:sz w:val="28"/>
         </w:rPr>
-        <w:t xml:space="preserve">Магистерская диссертация: 65 с., 10 рис., 6 табл., 43 источника, 3 приложения.</w:t>
+        <w:t xml:space="preserve">Магистерская диссертация: 67 с., 10 рис., 7 табл., 43 источника, 3 приложения.</w:t>
       </w:r>
     </w:p>
     <w:p>
@@ -7882,7 +7882,7 @@
           <w:rFonts w:ascii="Times New Roman" w:hAnsi="Times New Roman"/>
           <w:sz w:val="28"/>
         </w:rPr>
-        <w:t>Для анализа вклада отдельных компонентов предлагаемого метода спроектирована серия контрольных экспериментов (ablation study). Программный конвейер run_experiments.py автоматизирует последовательный запуск с единообразными гиперпараметрами.</w:t>
+        <w:t>Для анализа вклада отдельных компонентов предлагаемого метода спроектирована серия контрольных экспериментов (ablation study). Обучение выполняется через Kaggle notebooks, обеспечивающие последовательный запуск с единообразными гиперпараметрами.</w:t>
       </w:r>
     </w:p>
     <w:p>
@@ -10713,7 +10713,7 @@
           <w:rFonts w:ascii="Times New Roman" w:hAnsi="Times New Roman"/>
           <w:sz w:val="28"/>
         </w:rPr>
-        <w:t>Первое — улучшение баланса классов. Объединённый набор из двух датасетов характеризуется выраженным дисбалансом: DFD01 содержит лишь 10.6% реальных видео (363 из 3431), что смещает обучение. Добавление Celeb-DF v2 (17.9% реальных, 589 из 3299) частично компенсирует этот дисбаланс.</w:t>
+        <w:t>Первое — увеличение объёма и разнообразия обучающей выборки. Суммарный объём вырос с 6724 (2 датасета) до 10023 видео (3 датасета), что расширяет покрытие пространства признаков и снижает переобучение к артефактам конкретного генеративного метода.</w:t>
       </w:r>
     </w:p>
     <w:p>
@@ -11014,9 +11014,6 @@
           <w:sz w:val="28"/>
         </w:rPr>
         <w:t>Шестое: вычислительная стоимость предлагаемого метода выше, чем у покадровых baselines, поскольку требуется обработка T кадров через два backbone и Temporal Transformer. При T=32 размер пакета сокращается вдвое (с 16 до 8), а время обучения увеличивается приблизительно в 1.5 раза.</w:t>
-        <w:br/>
-        <w:br/>
-        <w:t>К ограничениям текущей версии работы относятся использование двух наборов данных из различных источников (без включения Celeb-DF-v2), отсутствие завершённой визуализации attention maps, а также необходимость расширения cross-dataset оценки на дополнительные наборы данных.</w:t>
       </w:r>
     </w:p>
     <w:p>
@@ -11044,7 +11041,7 @@
           <w:rFonts w:ascii="Times New Roman" w:hAnsi="Times New Roman"/>
           <w:sz w:val="28"/>
         </w:rPr>
-        <w:t>В данной главе представлена экспериментальная оценка предлагаемого метода в трёх измерениях: архитектурные конфигурации (ablation study), длина входной последовательности (T=16 vs T=32) и количество наборов данных (1 vs 2). На тестовой выборке DFDC02 полная модель (dual-path + adaptive fusion) при T=32 достигает AUC = 0.987, Accuracy = 95.7%, F1 = 0.955, EER = 0.045. Увеличение T с 16 до 32 даёт устойчивый прирост AUC от +0.005 до +0.010 для всех конфигураций. Мульти-датасетное обучение (DFDC02 + DFD01) показало снижение AUC до 0.899, однако выявило ключевой результат: временна́я ветвь (A3, AUC 0.900) обобщает лучше пространственной (A2, AUC 0.897) при разнородных данных, тогда как на одном датасете наблюдается обратное соотношение. Это подтверждает, что dual-path архитектура (A1 Full) является оптимальным выбором для практического применения, объединяя точность пространственной ветви с устойчивостью временно́й. Разработан прототип пользовательского интерфейса (Flask MVP), демонстрирующий практическую применимость метода.</w:t>
+        <w:t>В данной главе представлена экспериментальная оценка предлагаемого метода в четырёх измерениях: архитектурные конфигурации (ablation study), длина входной последовательности (T=16 vs T=32), количество наборов данных (1 vs 2 vs 3) и cross-dataset evaluation. На тестовой выборке DFDC02 полная модель (dual-path + adaptive fusion) при T=32 достигает AUC = 0.987, Accuracy = 95.7%, F1 = 0.955, EER = 0.045. Увеличение T с 16 до 32 даёт устойчивый прирост AUC от +0.005 до +0.010 для всех конфигураций. Обучение на трёх датасетах (DFDC02 + DFD01 + Celeb-DF v2, 10023 видео) показало AUC 0.959 для полной модели, подтвердив эффективность мультидатасетного подхода. Примечательно, что на трёх датасетах полная dual-path модель (A1) вновь превосходит все ablation-варианты (A2 Spatial: 0.949, A3 Temporal: 0.954), что подтверждает оптимальность dual-path архитектуры для практического применения. Разработан прототип пользовательского интерфейса (Flask MVP), демонстрирующий практическую применимость метода.</w:t>
       </w:r>
     </w:p>
     <w:p>
@@ -11972,7 +11969,7 @@
           <w:rFonts w:ascii="Times New Roman" w:hAnsi="Times New Roman"/>
           <w:sz w:val="28"/>
         </w:rPr>
-        <w:t xml:space="preserve">├── run_experiments.py — автоматизация ablation study</w:t>
+        <w:t xml:space="preserve">├── infer.py — single-sample inference (CLI)</w:t>
       </w:r>
     </w:p>
     <w:p>
@@ -12302,7 +12299,7 @@
           <w:rFonts w:ascii="Times New Roman" w:hAnsi="Times New Roman"/>
           <w:sz w:val="28"/>
         </w:rPr>
-        <w:t xml:space="preserve">5. Запустить серию ablation: python run_experiments.py</w:t>
+        <w:t xml:space="preserve">5. Запустить серию ablation: использовать Kaggle notebooks (kaggle-train.ipynb)</w:t>
       </w:r>
     </w:p>
     <w:p>

</xml_diff>